<commit_message>
Glass login page redesign and close menus on outside click
</commit_message>
<xml_diff>
--- a/docs/HD_Marketing_CRM_Complete_Documentation.docx
+++ b/docs/HD_Marketing_CRM_Complete_Documentation.docx
@@ -24240,7 +24240,7 @@
       <w:pPr/>
       <w:r>
         <w:rPr/>
-        <w:t xml:space="preserve">The current inventory covers 193 JavaScript/JSX modules, 549 explicitly named JavaScript functions/helpers (counted per module), and 236 latest PostgreSQL function definitions.</w:t>
+        <w:t xml:space="preserve">The current inventory covers 194 JavaScript/JSX modules, 555 explicitly named JavaScript functions/helpers (counted per module), and 236 latest PostgreSQL function definitions.</w:t>
       </w:r>
     </w:p>
     <w:p>
@@ -28701,6 +28701,70 @@
                 <w:sz w:val="19"/>
                 <w:color w:val="172C43"/>
               </w:rPr>
+              <w:t xml:space="preserve">client/src/components/login/GlassForm.jsx</w:t>
+            </w:r>
+          </w:p>
+        </w:tc>
+        <w:tc>
+          <w:tcPr>
+            <w:tcW w:w="3118" w:type="dxa"/>
+            <w:shd w:val="clear" w:fill="FFFFFF"/>
+            <w:vAlign w:val="top"/>
+          </w:tcPr>
+          <w:p>
+            <w:pPr>
+              <w:pStyle w:val="TableText"/>
+            </w:pPr>
+            <w:r>
+              <w:rPr>
+                <w:rFonts w:ascii="Consolas" w:hAnsi="Consolas"/>
+                <w:sz w:val="19"/>
+                <w:color w:val="172C43"/>
+              </w:rPr>
+              <w:t xml:space="preserve">GlassForm</w:t>
+            </w:r>
+          </w:p>
+        </w:tc>
+        <w:tc>
+          <w:tcPr>
+            <w:tcW w:w="4289" w:type="dxa"/>
+            <w:shd w:val="clear" w:fill="FFFFFF"/>
+            <w:vAlign w:val="top"/>
+          </w:tcPr>
+          <w:p>
+            <w:pPr>
+              <w:pStyle w:val="TableText"/>
+            </w:pPr>
+            <w:r>
+              <w:rPr>
+                <w:sz w:val="19"/>
+                <w:color w:val="172C43"/>
+              </w:rPr>
+              <w:t xml:space="preserve">Pill-style sign-in, reset and new-password fields with inline validation and a loading button.</w:t>
+            </w:r>
+          </w:p>
+        </w:tc>
+      </w:tr>
+      <w:tr>
+        <w:trPr>
+          <w:cantSplit/>
+        </w:trPr>
+        <w:tc>
+          <w:tcPr>
+            <w:tcW w:w="2339" w:type="dxa"/>
+            <w:shd w:val="clear" w:fill="F3F6F9"/>
+            <w:vAlign w:val="top"/>
+          </w:tcPr>
+          <w:p>
+            <w:pPr>
+              <w:pStyle w:val="TableText"/>
+            </w:pPr>
+            <w:r>
+              <w:rPr>
+                <w:rFonts w:ascii="Consolas" w:hAnsi="Consolas"/>
+                <w:sz w:val="19"/>
+                <w:color w:val="172C43"/>
+              </w:rPr>
               <w:t xml:space="preserve">client/src/components/properties/PhotoGallery.jsx</w:t>
             </w:r>
           </w:p>
@@ -28708,7 +28772,7 @@
         <w:tc>
           <w:tcPr>
             <w:tcW w:w="3118" w:type="dxa"/>
-            <w:shd w:val="clear" w:fill="FFFFFF"/>
+            <w:shd w:val="clear" w:fill="F3F6F9"/>
             <w:vAlign w:val="top"/>
           </w:tcPr>
           <w:p>
@@ -28728,7 +28792,7 @@
         <w:tc>
           <w:tcPr>
             <w:tcW w:w="4289" w:type="dxa"/>
-            <w:shd w:val="clear" w:fill="FFFFFF"/>
+            <w:shd w:val="clear" w:fill="F3F6F9"/>
             <w:vAlign w:val="top"/>
           </w:tcPr>
           <w:p>
@@ -28752,7 +28816,7 @@
         <w:tc>
           <w:tcPr>
             <w:tcW w:w="2339" w:type="dxa"/>
-            <w:shd w:val="clear" w:fill="F3F6F9"/>
+            <w:shd w:val="clear" w:fill="FFFFFF"/>
             <w:vAlign w:val="top"/>
           </w:tcPr>
           <w:p>
@@ -28772,7 +28836,7 @@
         <w:tc>
           <w:tcPr>
             <w:tcW w:w="3118" w:type="dxa"/>
-            <w:shd w:val="clear" w:fill="F3F6F9"/>
+            <w:shd w:val="clear" w:fill="FFFFFF"/>
             <w:vAlign w:val="top"/>
           </w:tcPr>
           <w:p>
@@ -28792,7 +28856,7 @@
         <w:tc>
           <w:tcPr>
             <w:tcW w:w="4289" w:type="dxa"/>
-            <w:shd w:val="clear" w:fill="F3F6F9"/>
+            <w:shd w:val="clear" w:fill="FFFFFF"/>
             <w:vAlign w:val="top"/>
           </w:tcPr>
           <w:p>
@@ -28816,7 +28880,7 @@
         <w:tc>
           <w:tcPr>
             <w:tcW w:w="2339" w:type="dxa"/>
-            <w:shd w:val="clear" w:fill="FFFFFF"/>
+            <w:shd w:val="clear" w:fill="F3F6F9"/>
             <w:vAlign w:val="top"/>
           </w:tcPr>
           <w:p>
@@ -28836,7 +28900,7 @@
         <w:tc>
           <w:tcPr>
             <w:tcW w:w="3118" w:type="dxa"/>
-            <w:shd w:val="clear" w:fill="FFFFFF"/>
+            <w:shd w:val="clear" w:fill="F3F6F9"/>
             <w:vAlign w:val="top"/>
           </w:tcPr>
           <w:p>
@@ -28856,7 +28920,7 @@
         <w:tc>
           <w:tcPr>
             <w:tcW w:w="4289" w:type="dxa"/>
-            <w:shd w:val="clear" w:fill="FFFFFF"/>
+            <w:shd w:val="clear" w:fill="F3F6F9"/>
             <w:vAlign w:val="top"/>
           </w:tcPr>
           <w:p>
@@ -28880,7 +28944,7 @@
         <w:tc>
           <w:tcPr>
             <w:tcW w:w="2339" w:type="dxa"/>
-            <w:shd w:val="clear" w:fill="F3F6F9"/>
+            <w:shd w:val="clear" w:fill="FFFFFF"/>
             <w:vAlign w:val="top"/>
           </w:tcPr>
           <w:p>
@@ -28900,7 +28964,7 @@
         <w:tc>
           <w:tcPr>
             <w:tcW w:w="3118" w:type="dxa"/>
-            <w:shd w:val="clear" w:fill="F3F6F9"/>
+            <w:shd w:val="clear" w:fill="FFFFFF"/>
             <w:vAlign w:val="top"/>
           </w:tcPr>
           <w:p>
@@ -28920,7 +28984,7 @@
         <w:tc>
           <w:tcPr>
             <w:tcW w:w="4289" w:type="dxa"/>
-            <w:shd w:val="clear" w:fill="F3F6F9"/>
+            <w:shd w:val="clear" w:fill="FFFFFF"/>
             <w:vAlign w:val="top"/>
           </w:tcPr>
           <w:p>
@@ -28944,7 +29008,7 @@
         <w:tc>
           <w:tcPr>
             <w:tcW w:w="2339" w:type="dxa"/>
-            <w:shd w:val="clear" w:fill="FFFFFF"/>
+            <w:shd w:val="clear" w:fill="F3F6F9"/>
             <w:vAlign w:val="top"/>
           </w:tcPr>
           <w:p>
@@ -28964,7 +29028,7 @@
         <w:tc>
           <w:tcPr>
             <w:tcW w:w="3118" w:type="dxa"/>
-            <w:shd w:val="clear" w:fill="FFFFFF"/>
+            <w:shd w:val="clear" w:fill="F3F6F9"/>
             <w:vAlign w:val="top"/>
           </w:tcPr>
           <w:p>
@@ -29014,7 +29078,7 @@
         <w:tc>
           <w:tcPr>
             <w:tcW w:w="4289" w:type="dxa"/>
-            <w:shd w:val="clear" w:fill="FFFFFF"/>
+            <w:shd w:val="clear" w:fill="F3F6F9"/>
             <w:vAlign w:val="top"/>
           </w:tcPr>
           <w:p>
@@ -29038,7 +29102,7 @@
         <w:tc>
           <w:tcPr>
             <w:tcW w:w="2339" w:type="dxa"/>
-            <w:shd w:val="clear" w:fill="F3F6F9"/>
+            <w:shd w:val="clear" w:fill="FFFFFF"/>
             <w:vAlign w:val="top"/>
           </w:tcPr>
           <w:p>
@@ -29058,7 +29122,7 @@
         <w:tc>
           <w:tcPr>
             <w:tcW w:w="3118" w:type="dxa"/>
-            <w:shd w:val="clear" w:fill="F3F6F9"/>
+            <w:shd w:val="clear" w:fill="FFFFFF"/>
             <w:vAlign w:val="top"/>
           </w:tcPr>
           <w:p>
@@ -29123,7 +29187,7 @@
         <w:tc>
           <w:tcPr>
             <w:tcW w:w="4289" w:type="dxa"/>
-            <w:shd w:val="clear" w:fill="F3F6F9"/>
+            <w:shd w:val="clear" w:fill="FFFFFF"/>
             <w:vAlign w:val="top"/>
           </w:tcPr>
           <w:p>
@@ -29147,7 +29211,7 @@
         <w:tc>
           <w:tcPr>
             <w:tcW w:w="2339" w:type="dxa"/>
-            <w:shd w:val="clear" w:fill="FFFFFF"/>
+            <w:shd w:val="clear" w:fill="F3F6F9"/>
             <w:vAlign w:val="top"/>
           </w:tcPr>
           <w:p>
@@ -29167,7 +29231,7 @@
         <w:tc>
           <w:tcPr>
             <w:tcW w:w="3118" w:type="dxa"/>
-            <w:shd w:val="clear" w:fill="FFFFFF"/>
+            <w:shd w:val="clear" w:fill="F3F6F9"/>
             <w:vAlign w:val="top"/>
           </w:tcPr>
           <w:p>
@@ -29202,7 +29266,7 @@
         <w:tc>
           <w:tcPr>
             <w:tcW w:w="4289" w:type="dxa"/>
-            <w:shd w:val="clear" w:fill="FFFFFF"/>
+            <w:shd w:val="clear" w:fill="F3F6F9"/>
             <w:vAlign w:val="top"/>
           </w:tcPr>
           <w:p>
@@ -29226,7 +29290,7 @@
         <w:tc>
           <w:tcPr>
             <w:tcW w:w="2339" w:type="dxa"/>
-            <w:shd w:val="clear" w:fill="F3F6F9"/>
+            <w:shd w:val="clear" w:fill="FFFFFF"/>
             <w:vAlign w:val="top"/>
           </w:tcPr>
           <w:p>
@@ -29246,7 +29310,7 @@
         <w:tc>
           <w:tcPr>
             <w:tcW w:w="3118" w:type="dxa"/>
-            <w:shd w:val="clear" w:fill="F3F6F9"/>
+            <w:shd w:val="clear" w:fill="FFFFFF"/>
             <w:vAlign w:val="top"/>
           </w:tcPr>
           <w:p>
@@ -29296,7 +29360,7 @@
         <w:tc>
           <w:tcPr>
             <w:tcW w:w="4289" w:type="dxa"/>
-            <w:shd w:val="clear" w:fill="F3F6F9"/>
+            <w:shd w:val="clear" w:fill="FFFFFF"/>
             <w:vAlign w:val="top"/>
           </w:tcPr>
           <w:p>
@@ -29320,7 +29384,7 @@
         <w:tc>
           <w:tcPr>
             <w:tcW w:w="2339" w:type="dxa"/>
-            <w:shd w:val="clear" w:fill="FFFFFF"/>
+            <w:shd w:val="clear" w:fill="F3F6F9"/>
             <w:vAlign w:val="top"/>
           </w:tcPr>
           <w:p>
@@ -29340,7 +29404,7 @@
         <w:tc>
           <w:tcPr>
             <w:tcW w:w="3118" w:type="dxa"/>
-            <w:shd w:val="clear" w:fill="FFFFFF"/>
+            <w:shd w:val="clear" w:fill="F3F6F9"/>
             <w:vAlign w:val="top"/>
           </w:tcPr>
           <w:p>
@@ -29360,7 +29424,7 @@
         <w:tc>
           <w:tcPr>
             <w:tcW w:w="4289" w:type="dxa"/>
-            <w:shd w:val="clear" w:fill="FFFFFF"/>
+            <w:shd w:val="clear" w:fill="F3F6F9"/>
             <w:vAlign w:val="top"/>
           </w:tcPr>
           <w:p>
@@ -29384,7 +29448,7 @@
         <w:tc>
           <w:tcPr>
             <w:tcW w:w="2339" w:type="dxa"/>
-            <w:shd w:val="clear" w:fill="F3F6F9"/>
+            <w:shd w:val="clear" w:fill="FFFFFF"/>
             <w:vAlign w:val="top"/>
           </w:tcPr>
           <w:p>
@@ -29404,7 +29468,7 @@
         <w:tc>
           <w:tcPr>
             <w:tcW w:w="3118" w:type="dxa"/>
-            <w:shd w:val="clear" w:fill="F3F6F9"/>
+            <w:shd w:val="clear" w:fill="FFFFFF"/>
             <w:vAlign w:val="top"/>
           </w:tcPr>
           <w:p>
@@ -29424,7 +29488,7 @@
         <w:tc>
           <w:tcPr>
             <w:tcW w:w="4289" w:type="dxa"/>
-            <w:shd w:val="clear" w:fill="F3F6F9"/>
+            <w:shd w:val="clear" w:fill="FFFFFF"/>
             <w:vAlign w:val="top"/>
           </w:tcPr>
           <w:p>
@@ -29448,7 +29512,7 @@
         <w:tc>
           <w:tcPr>
             <w:tcW w:w="2339" w:type="dxa"/>
-            <w:shd w:val="clear" w:fill="FFFFFF"/>
+            <w:shd w:val="clear" w:fill="F3F6F9"/>
             <w:vAlign w:val="top"/>
           </w:tcPr>
           <w:p>
@@ -29468,7 +29532,7 @@
         <w:tc>
           <w:tcPr>
             <w:tcW w:w="3118" w:type="dxa"/>
-            <w:shd w:val="clear" w:fill="FFFFFF"/>
+            <w:shd w:val="clear" w:fill="F3F6F9"/>
             <w:vAlign w:val="top"/>
           </w:tcPr>
           <w:p>
@@ -29518,7 +29582,7 @@
         <w:tc>
           <w:tcPr>
             <w:tcW w:w="4289" w:type="dxa"/>
-            <w:shd w:val="clear" w:fill="FFFFFF"/>
+            <w:shd w:val="clear" w:fill="F3F6F9"/>
             <w:vAlign w:val="top"/>
           </w:tcPr>
           <w:p>
@@ -29542,7 +29606,7 @@
         <w:tc>
           <w:tcPr>
             <w:tcW w:w="2339" w:type="dxa"/>
-            <w:shd w:val="clear" w:fill="F3F6F9"/>
+            <w:shd w:val="clear" w:fill="FFFFFF"/>
             <w:vAlign w:val="top"/>
           </w:tcPr>
           <w:p>
@@ -29562,7 +29626,7 @@
         <w:tc>
           <w:tcPr>
             <w:tcW w:w="3118" w:type="dxa"/>
-            <w:shd w:val="clear" w:fill="F3F6F9"/>
+            <w:shd w:val="clear" w:fill="FFFFFF"/>
             <w:vAlign w:val="top"/>
           </w:tcPr>
           <w:p>
@@ -29582,7 +29646,7 @@
         <w:tc>
           <w:tcPr>
             <w:tcW w:w="4289" w:type="dxa"/>
-            <w:shd w:val="clear" w:fill="F3F6F9"/>
+            <w:shd w:val="clear" w:fill="FFFFFF"/>
             <w:vAlign w:val="top"/>
           </w:tcPr>
           <w:p>
@@ -29606,7 +29670,7 @@
         <w:tc>
           <w:tcPr>
             <w:tcW w:w="2339" w:type="dxa"/>
-            <w:shd w:val="clear" w:fill="FFFFFF"/>
+            <w:shd w:val="clear" w:fill="F3F6F9"/>
             <w:vAlign w:val="top"/>
           </w:tcPr>
           <w:p>
@@ -29626,7 +29690,7 @@
         <w:tc>
           <w:tcPr>
             <w:tcW w:w="3118" w:type="dxa"/>
-            <w:shd w:val="clear" w:fill="FFFFFF"/>
+            <w:shd w:val="clear" w:fill="F3F6F9"/>
             <w:vAlign w:val="top"/>
           </w:tcPr>
           <w:p>
@@ -29736,7 +29800,7 @@
         <w:tc>
           <w:tcPr>
             <w:tcW w:w="4289" w:type="dxa"/>
-            <w:shd w:val="clear" w:fill="FFFFFF"/>
+            <w:shd w:val="clear" w:fill="F3F6F9"/>
             <w:vAlign w:val="top"/>
           </w:tcPr>
           <w:p>
@@ -29760,7 +29824,7 @@
         <w:tc>
           <w:tcPr>
             <w:tcW w:w="2339" w:type="dxa"/>
-            <w:shd w:val="clear" w:fill="F3F6F9"/>
+            <w:shd w:val="clear" w:fill="FFFFFF"/>
             <w:vAlign w:val="top"/>
           </w:tcPr>
           <w:p>
@@ -29780,7 +29844,7 @@
         <w:tc>
           <w:tcPr>
             <w:tcW w:w="3118" w:type="dxa"/>
-            <w:shd w:val="clear" w:fill="F3F6F9"/>
+            <w:shd w:val="clear" w:fill="FFFFFF"/>
             <w:vAlign w:val="top"/>
           </w:tcPr>
           <w:p>
@@ -29845,7 +29909,7 @@
         <w:tc>
           <w:tcPr>
             <w:tcW w:w="4289" w:type="dxa"/>
-            <w:shd w:val="clear" w:fill="F3F6F9"/>
+            <w:shd w:val="clear" w:fill="FFFFFF"/>
             <w:vAlign w:val="top"/>
           </w:tcPr>
           <w:p>
@@ -29869,7 +29933,7 @@
         <w:tc>
           <w:tcPr>
             <w:tcW w:w="2339" w:type="dxa"/>
-            <w:shd w:val="clear" w:fill="FFFFFF"/>
+            <w:shd w:val="clear" w:fill="F3F6F9"/>
             <w:vAlign w:val="top"/>
           </w:tcPr>
           <w:p>
@@ -29889,7 +29953,7 @@
         <w:tc>
           <w:tcPr>
             <w:tcW w:w="3118" w:type="dxa"/>
-            <w:shd w:val="clear" w:fill="FFFFFF"/>
+            <w:shd w:val="clear" w:fill="F3F6F9"/>
             <w:vAlign w:val="top"/>
           </w:tcPr>
           <w:p>
@@ -29924,7 +29988,7 @@
         <w:tc>
           <w:tcPr>
             <w:tcW w:w="4289" w:type="dxa"/>
-            <w:shd w:val="clear" w:fill="FFFFFF"/>
+            <w:shd w:val="clear" w:fill="F3F6F9"/>
             <w:vAlign w:val="top"/>
           </w:tcPr>
           <w:p>
@@ -29948,7 +30012,7 @@
         <w:tc>
           <w:tcPr>
             <w:tcW w:w="2339" w:type="dxa"/>
-            <w:shd w:val="clear" w:fill="F3F6F9"/>
+            <w:shd w:val="clear" w:fill="FFFFFF"/>
             <w:vAlign w:val="top"/>
           </w:tcPr>
           <w:p>
@@ -29968,7 +30032,7 @@
         <w:tc>
           <w:tcPr>
             <w:tcW w:w="3118" w:type="dxa"/>
-            <w:shd w:val="clear" w:fill="F3F6F9"/>
+            <w:shd w:val="clear" w:fill="FFFFFF"/>
             <w:vAlign w:val="top"/>
           </w:tcPr>
           <w:p>
@@ -30093,7 +30157,7 @@
         <w:tc>
           <w:tcPr>
             <w:tcW w:w="4289" w:type="dxa"/>
-            <w:shd w:val="clear" w:fill="F3F6F9"/>
+            <w:shd w:val="clear" w:fill="FFFFFF"/>
             <w:vAlign w:val="top"/>
           </w:tcPr>
           <w:p>
@@ -30117,7 +30181,7 @@
         <w:tc>
           <w:tcPr>
             <w:tcW w:w="2339" w:type="dxa"/>
-            <w:shd w:val="clear" w:fill="FFFFFF"/>
+            <w:shd w:val="clear" w:fill="F3F6F9"/>
             <w:vAlign w:val="top"/>
           </w:tcPr>
           <w:p>
@@ -30137,7 +30201,7 @@
         <w:tc>
           <w:tcPr>
             <w:tcW w:w="3118" w:type="dxa"/>
-            <w:shd w:val="clear" w:fill="FFFFFF"/>
+            <w:shd w:val="clear" w:fill="F3F6F9"/>
             <w:vAlign w:val="top"/>
           </w:tcPr>
           <w:p>
@@ -30322,7 +30386,7 @@
         <w:tc>
           <w:tcPr>
             <w:tcW w:w="4289" w:type="dxa"/>
-            <w:shd w:val="clear" w:fill="FFFFFF"/>
+            <w:shd w:val="clear" w:fill="F3F6F9"/>
             <w:vAlign w:val="top"/>
           </w:tcPr>
           <w:p>
@@ -30346,7 +30410,7 @@
         <w:tc>
           <w:tcPr>
             <w:tcW w:w="2339" w:type="dxa"/>
-            <w:shd w:val="clear" w:fill="F3F6F9"/>
+            <w:shd w:val="clear" w:fill="FFFFFF"/>
             <w:vAlign w:val="top"/>
           </w:tcPr>
           <w:p>
@@ -30366,7 +30430,7 @@
         <w:tc>
           <w:tcPr>
             <w:tcW w:w="3118" w:type="dxa"/>
-            <w:shd w:val="clear" w:fill="F3F6F9"/>
+            <w:shd w:val="clear" w:fill="FFFFFF"/>
             <w:vAlign w:val="top"/>
           </w:tcPr>
           <w:p>
@@ -30611,7 +30675,7 @@
         <w:tc>
           <w:tcPr>
             <w:tcW w:w="4289" w:type="dxa"/>
-            <w:shd w:val="clear" w:fill="F3F6F9"/>
+            <w:shd w:val="clear" w:fill="FFFFFF"/>
             <w:vAlign w:val="top"/>
           </w:tcPr>
           <w:p>
@@ -30635,7 +30699,7 @@
         <w:tc>
           <w:tcPr>
             <w:tcW w:w="2339" w:type="dxa"/>
-            <w:shd w:val="clear" w:fill="FFFFFF"/>
+            <w:shd w:val="clear" w:fill="F3F6F9"/>
             <w:vAlign w:val="top"/>
           </w:tcPr>
           <w:p>
@@ -30655,7 +30719,7 @@
         <w:tc>
           <w:tcPr>
             <w:tcW w:w="3118" w:type="dxa"/>
-            <w:shd w:val="clear" w:fill="FFFFFF"/>
+            <w:shd w:val="clear" w:fill="F3F6F9"/>
             <w:vAlign w:val="top"/>
           </w:tcPr>
           <w:p>
@@ -30675,7 +30739,7 @@
         <w:tc>
           <w:tcPr>
             <w:tcW w:w="4289" w:type="dxa"/>
-            <w:shd w:val="clear" w:fill="FFFFFF"/>
+            <w:shd w:val="clear" w:fill="F3F6F9"/>
             <w:vAlign w:val="top"/>
           </w:tcPr>
           <w:p>
@@ -30699,7 +30763,7 @@
         <w:tc>
           <w:tcPr>
             <w:tcW w:w="2339" w:type="dxa"/>
-            <w:shd w:val="clear" w:fill="F3F6F9"/>
+            <w:shd w:val="clear" w:fill="FFFFFF"/>
             <w:vAlign w:val="top"/>
           </w:tcPr>
           <w:p>
@@ -30719,7 +30783,7 @@
         <w:tc>
           <w:tcPr>
             <w:tcW w:w="3118" w:type="dxa"/>
-            <w:shd w:val="clear" w:fill="F3F6F9"/>
+            <w:shd w:val="clear" w:fill="FFFFFF"/>
             <w:vAlign w:val="top"/>
           </w:tcPr>
           <w:p>
@@ -30739,7 +30803,7 @@
         <w:tc>
           <w:tcPr>
             <w:tcW w:w="4289" w:type="dxa"/>
-            <w:shd w:val="clear" w:fill="F3F6F9"/>
+            <w:shd w:val="clear" w:fill="FFFFFF"/>
             <w:vAlign w:val="top"/>
           </w:tcPr>
           <w:p>
@@ -30763,7 +30827,7 @@
         <w:tc>
           <w:tcPr>
             <w:tcW w:w="2339" w:type="dxa"/>
-            <w:shd w:val="clear" w:fill="FFFFFF"/>
+            <w:shd w:val="clear" w:fill="F3F6F9"/>
             <w:vAlign w:val="top"/>
           </w:tcPr>
           <w:p>
@@ -30783,7 +30847,7 @@
         <w:tc>
           <w:tcPr>
             <w:tcW w:w="3118" w:type="dxa"/>
-            <w:shd w:val="clear" w:fill="FFFFFF"/>
+            <w:shd w:val="clear" w:fill="F3F6F9"/>
             <w:vAlign w:val="top"/>
           </w:tcPr>
           <w:p>
@@ -31073,7 +31137,7 @@
         <w:tc>
           <w:tcPr>
             <w:tcW w:w="4289" w:type="dxa"/>
-            <w:shd w:val="clear" w:fill="FFFFFF"/>
+            <w:shd w:val="clear" w:fill="F3F6F9"/>
             <w:vAlign w:val="top"/>
           </w:tcPr>
           <w:p>
@@ -31097,7 +31161,7 @@
         <w:tc>
           <w:tcPr>
             <w:tcW w:w="2339" w:type="dxa"/>
-            <w:shd w:val="clear" w:fill="F3F6F9"/>
+            <w:shd w:val="clear" w:fill="FFFFFF"/>
             <w:vAlign w:val="top"/>
           </w:tcPr>
           <w:p>
@@ -31117,7 +31181,7 @@
         <w:tc>
           <w:tcPr>
             <w:tcW w:w="3118" w:type="dxa"/>
-            <w:shd w:val="clear" w:fill="F3F6F9"/>
+            <w:shd w:val="clear" w:fill="FFFFFF"/>
             <w:vAlign w:val="top"/>
           </w:tcPr>
           <w:p>
@@ -31137,7 +31201,7 @@
         <w:tc>
           <w:tcPr>
             <w:tcW w:w="4289" w:type="dxa"/>
-            <w:shd w:val="clear" w:fill="F3F6F9"/>
+            <w:shd w:val="clear" w:fill="FFFFFF"/>
             <w:vAlign w:val="top"/>
           </w:tcPr>
           <w:p>
@@ -31161,7 +31225,7 @@
         <w:tc>
           <w:tcPr>
             <w:tcW w:w="2339" w:type="dxa"/>
-            <w:shd w:val="clear" w:fill="FFFFFF"/>
+            <w:shd w:val="clear" w:fill="F3F6F9"/>
             <w:vAlign w:val="top"/>
           </w:tcPr>
           <w:p>
@@ -31181,7 +31245,7 @@
         <w:tc>
           <w:tcPr>
             <w:tcW w:w="3118" w:type="dxa"/>
-            <w:shd w:val="clear" w:fill="FFFFFF"/>
+            <w:shd w:val="clear" w:fill="F3F6F9"/>
             <w:vAlign w:val="top"/>
           </w:tcPr>
           <w:p>
@@ -31201,7 +31265,7 @@
         <w:tc>
           <w:tcPr>
             <w:tcW w:w="4289" w:type="dxa"/>
-            <w:shd w:val="clear" w:fill="FFFFFF"/>
+            <w:shd w:val="clear" w:fill="F3F6F9"/>
             <w:vAlign w:val="top"/>
           </w:tcPr>
           <w:p>
@@ -31225,7 +31289,7 @@
         <w:tc>
           <w:tcPr>
             <w:tcW w:w="2339" w:type="dxa"/>
-            <w:shd w:val="clear" w:fill="F3F6F9"/>
+            <w:shd w:val="clear" w:fill="FFFFFF"/>
             <w:vAlign w:val="top"/>
           </w:tcPr>
           <w:p>
@@ -31245,7 +31309,7 @@
         <w:tc>
           <w:tcPr>
             <w:tcW w:w="3118" w:type="dxa"/>
-            <w:shd w:val="clear" w:fill="F3F6F9"/>
+            <w:shd w:val="clear" w:fill="FFFFFF"/>
             <w:vAlign w:val="top"/>
           </w:tcPr>
           <w:p>
@@ -31310,7 +31374,7 @@
         <w:tc>
           <w:tcPr>
             <w:tcW w:w="4289" w:type="dxa"/>
-            <w:shd w:val="clear" w:fill="F3F6F9"/>
+            <w:shd w:val="clear" w:fill="FFFFFF"/>
             <w:vAlign w:val="top"/>
           </w:tcPr>
           <w:p>
@@ -31334,7 +31398,7 @@
         <w:tc>
           <w:tcPr>
             <w:tcW w:w="2339" w:type="dxa"/>
-            <w:shd w:val="clear" w:fill="FFFFFF"/>
+            <w:shd w:val="clear" w:fill="F3F6F9"/>
             <w:vAlign w:val="top"/>
           </w:tcPr>
           <w:p>
@@ -31354,7 +31418,7 @@
         <w:tc>
           <w:tcPr>
             <w:tcW w:w="3118" w:type="dxa"/>
-            <w:shd w:val="clear" w:fill="FFFFFF"/>
+            <w:shd w:val="clear" w:fill="F3F6F9"/>
             <w:vAlign w:val="top"/>
           </w:tcPr>
           <w:p>
@@ -31389,7 +31453,7 @@
         <w:tc>
           <w:tcPr>
             <w:tcW w:w="4289" w:type="dxa"/>
-            <w:shd w:val="clear" w:fill="FFFFFF"/>
+            <w:shd w:val="clear" w:fill="F3F6F9"/>
             <w:vAlign w:val="top"/>
           </w:tcPr>
           <w:p>
@@ -31413,7 +31477,7 @@
         <w:tc>
           <w:tcPr>
             <w:tcW w:w="2339" w:type="dxa"/>
-            <w:shd w:val="clear" w:fill="F3F6F9"/>
+            <w:shd w:val="clear" w:fill="FFFFFF"/>
             <w:vAlign w:val="top"/>
           </w:tcPr>
           <w:p>
@@ -31433,7 +31497,7 @@
         <w:tc>
           <w:tcPr>
             <w:tcW w:w="3118" w:type="dxa"/>
-            <w:shd w:val="clear" w:fill="F3F6F9"/>
+            <w:shd w:val="clear" w:fill="FFFFFF"/>
             <w:vAlign w:val="top"/>
           </w:tcPr>
           <w:p>
@@ -31453,7 +31517,7 @@
         <w:tc>
           <w:tcPr>
             <w:tcW w:w="4289" w:type="dxa"/>
-            <w:shd w:val="clear" w:fill="F3F6F9"/>
+            <w:shd w:val="clear" w:fill="FFFFFF"/>
             <w:vAlign w:val="top"/>
           </w:tcPr>
           <w:p>
@@ -31477,7 +31541,7 @@
         <w:tc>
           <w:tcPr>
             <w:tcW w:w="2339" w:type="dxa"/>
-            <w:shd w:val="clear" w:fill="FFFFFF"/>
+            <w:shd w:val="clear" w:fill="F3F6F9"/>
             <w:vAlign w:val="top"/>
           </w:tcPr>
           <w:p>
@@ -31497,7 +31561,7 @@
         <w:tc>
           <w:tcPr>
             <w:tcW w:w="3118" w:type="dxa"/>
-            <w:shd w:val="clear" w:fill="FFFFFF"/>
+            <w:shd w:val="clear" w:fill="F3F6F9"/>
             <w:vAlign w:val="top"/>
           </w:tcPr>
           <w:p>
@@ -31517,7 +31581,7 @@
         <w:tc>
           <w:tcPr>
             <w:tcW w:w="4289" w:type="dxa"/>
-            <w:shd w:val="clear" w:fill="FFFFFF"/>
+            <w:shd w:val="clear" w:fill="F3F6F9"/>
             <w:vAlign w:val="top"/>
           </w:tcPr>
           <w:p>
@@ -31541,7 +31605,7 @@
         <w:tc>
           <w:tcPr>
             <w:tcW w:w="2339" w:type="dxa"/>
-            <w:shd w:val="clear" w:fill="F3F6F9"/>
+            <w:shd w:val="clear" w:fill="FFFFFF"/>
             <w:vAlign w:val="top"/>
           </w:tcPr>
           <w:p>
@@ -31561,7 +31625,7 @@
         <w:tc>
           <w:tcPr>
             <w:tcW w:w="3118" w:type="dxa"/>
-            <w:shd w:val="clear" w:fill="F3F6F9"/>
+            <w:shd w:val="clear" w:fill="FFFFFF"/>
             <w:vAlign w:val="top"/>
           </w:tcPr>
           <w:p>
@@ -31626,7 +31690,7 @@
         <w:tc>
           <w:tcPr>
             <w:tcW w:w="4289" w:type="dxa"/>
-            <w:shd w:val="clear" w:fill="F3F6F9"/>
+            <w:shd w:val="clear" w:fill="FFFFFF"/>
             <w:vAlign w:val="top"/>
           </w:tcPr>
           <w:p>
@@ -31650,7 +31714,7 @@
         <w:tc>
           <w:tcPr>
             <w:tcW w:w="2339" w:type="dxa"/>
-            <w:shd w:val="clear" w:fill="FFFFFF"/>
+            <w:shd w:val="clear" w:fill="F3F6F9"/>
             <w:vAlign w:val="top"/>
           </w:tcPr>
           <w:p>
@@ -31670,7 +31734,7 @@
         <w:tc>
           <w:tcPr>
             <w:tcW w:w="3118" w:type="dxa"/>
-            <w:shd w:val="clear" w:fill="FFFFFF"/>
+            <w:shd w:val="clear" w:fill="F3F6F9"/>
             <w:vAlign w:val="top"/>
           </w:tcPr>
           <w:p>
@@ -31720,7 +31784,7 @@
         <w:tc>
           <w:tcPr>
             <w:tcW w:w="4289" w:type="dxa"/>
-            <w:shd w:val="clear" w:fill="FFFFFF"/>
+            <w:shd w:val="clear" w:fill="F3F6F9"/>
             <w:vAlign w:val="top"/>
           </w:tcPr>
           <w:p>
@@ -31744,7 +31808,7 @@
         <w:tc>
           <w:tcPr>
             <w:tcW w:w="2339" w:type="dxa"/>
-            <w:shd w:val="clear" w:fill="F3F6F9"/>
+            <w:shd w:val="clear" w:fill="FFFFFF"/>
             <w:vAlign w:val="top"/>
           </w:tcPr>
           <w:p>
@@ -31764,7 +31828,7 @@
         <w:tc>
           <w:tcPr>
             <w:tcW w:w="3118" w:type="dxa"/>
-            <w:shd w:val="clear" w:fill="F3F6F9"/>
+            <w:shd w:val="clear" w:fill="FFFFFF"/>
             <w:vAlign w:val="top"/>
           </w:tcPr>
           <w:p>
@@ -31844,7 +31908,7 @@
         <w:tc>
           <w:tcPr>
             <w:tcW w:w="4289" w:type="dxa"/>
-            <w:shd w:val="clear" w:fill="F3F6F9"/>
+            <w:shd w:val="clear" w:fill="FFFFFF"/>
             <w:vAlign w:val="top"/>
           </w:tcPr>
           <w:p>
@@ -31868,7 +31932,7 @@
         <w:tc>
           <w:tcPr>
             <w:tcW w:w="2339" w:type="dxa"/>
-            <w:shd w:val="clear" w:fill="FFFFFF"/>
+            <w:shd w:val="clear" w:fill="F3F6F9"/>
             <w:vAlign w:val="top"/>
           </w:tcPr>
           <w:p>
@@ -31888,7 +31952,7 @@
         <w:tc>
           <w:tcPr>
             <w:tcW w:w="3118" w:type="dxa"/>
-            <w:shd w:val="clear" w:fill="FFFFFF"/>
+            <w:shd w:val="clear" w:fill="F3F6F9"/>
             <w:vAlign w:val="top"/>
           </w:tcPr>
           <w:p>
@@ -31923,7 +31987,7 @@
         <w:tc>
           <w:tcPr>
             <w:tcW w:w="4289" w:type="dxa"/>
-            <w:shd w:val="clear" w:fill="FFFFFF"/>
+            <w:shd w:val="clear" w:fill="F3F6F9"/>
             <w:vAlign w:val="top"/>
           </w:tcPr>
           <w:p>
@@ -31947,7 +32011,7 @@
         <w:tc>
           <w:tcPr>
             <w:tcW w:w="2339" w:type="dxa"/>
-            <w:shd w:val="clear" w:fill="F3F6F9"/>
+            <w:shd w:val="clear" w:fill="FFFFFF"/>
             <w:vAlign w:val="top"/>
           </w:tcPr>
           <w:p>
@@ -31967,7 +32031,7 @@
         <w:tc>
           <w:tcPr>
             <w:tcW w:w="3118" w:type="dxa"/>
-            <w:shd w:val="clear" w:fill="F3F6F9"/>
+            <w:shd w:val="clear" w:fill="FFFFFF"/>
             <w:vAlign w:val="top"/>
           </w:tcPr>
           <w:p>
@@ -31987,7 +32051,7 @@
         <w:tc>
           <w:tcPr>
             <w:tcW w:w="4289" w:type="dxa"/>
-            <w:shd w:val="clear" w:fill="F3F6F9"/>
+            <w:shd w:val="clear" w:fill="FFFFFF"/>
             <w:vAlign w:val="top"/>
           </w:tcPr>
           <w:p>
@@ -32011,7 +32075,7 @@
         <w:tc>
           <w:tcPr>
             <w:tcW w:w="2339" w:type="dxa"/>
-            <w:shd w:val="clear" w:fill="FFFFFF"/>
+            <w:shd w:val="clear" w:fill="F3F6F9"/>
             <w:vAlign w:val="top"/>
           </w:tcPr>
           <w:p>
@@ -32031,7 +32095,7 @@
         <w:tc>
           <w:tcPr>
             <w:tcW w:w="3118" w:type="dxa"/>
-            <w:shd w:val="clear" w:fill="FFFFFF"/>
+            <w:shd w:val="clear" w:fill="F3F6F9"/>
             <w:vAlign w:val="top"/>
           </w:tcPr>
           <w:p>
@@ -32066,7 +32130,7 @@
         <w:tc>
           <w:tcPr>
             <w:tcW w:w="4289" w:type="dxa"/>
-            <w:shd w:val="clear" w:fill="FFFFFF"/>
+            <w:shd w:val="clear" w:fill="F3F6F9"/>
             <w:vAlign w:val="top"/>
           </w:tcPr>
           <w:p>
@@ -32090,7 +32154,7 @@
         <w:tc>
           <w:tcPr>
             <w:tcW w:w="2339" w:type="dxa"/>
-            <w:shd w:val="clear" w:fill="F3F6F9"/>
+            <w:shd w:val="clear" w:fill="FFFFFF"/>
             <w:vAlign w:val="top"/>
           </w:tcPr>
           <w:p>
@@ -32110,7 +32174,7 @@
         <w:tc>
           <w:tcPr>
             <w:tcW w:w="3118" w:type="dxa"/>
-            <w:shd w:val="clear" w:fill="F3F6F9"/>
+            <w:shd w:val="clear" w:fill="FFFFFF"/>
             <w:vAlign w:val="top"/>
           </w:tcPr>
           <w:p>
@@ -32145,7 +32209,7 @@
         <w:tc>
           <w:tcPr>
             <w:tcW w:w="4289" w:type="dxa"/>
-            <w:shd w:val="clear" w:fill="F3F6F9"/>
+            <w:shd w:val="clear" w:fill="FFFFFF"/>
             <w:vAlign w:val="top"/>
           </w:tcPr>
           <w:p>
@@ -32169,7 +32233,7 @@
         <w:tc>
           <w:tcPr>
             <w:tcW w:w="2339" w:type="dxa"/>
-            <w:shd w:val="clear" w:fill="FFFFFF"/>
+            <w:shd w:val="clear" w:fill="F3F6F9"/>
             <w:vAlign w:val="top"/>
           </w:tcPr>
           <w:p>
@@ -32189,7 +32253,7 @@
         <w:tc>
           <w:tcPr>
             <w:tcW w:w="3118" w:type="dxa"/>
-            <w:shd w:val="clear" w:fill="FFFFFF"/>
+            <w:shd w:val="clear" w:fill="F3F6F9"/>
             <w:vAlign w:val="top"/>
           </w:tcPr>
           <w:p>
@@ -32209,7 +32273,7 @@
         <w:tc>
           <w:tcPr>
             <w:tcW w:w="4289" w:type="dxa"/>
-            <w:shd w:val="clear" w:fill="FFFFFF"/>
+            <w:shd w:val="clear" w:fill="F3F6F9"/>
             <w:vAlign w:val="top"/>
           </w:tcPr>
           <w:p>
@@ -32233,7 +32297,7 @@
         <w:tc>
           <w:tcPr>
             <w:tcW w:w="2339" w:type="dxa"/>
-            <w:shd w:val="clear" w:fill="F3F6F9"/>
+            <w:shd w:val="clear" w:fill="FFFFFF"/>
             <w:vAlign w:val="top"/>
           </w:tcPr>
           <w:p>
@@ -32253,7 +32317,7 @@
         <w:tc>
           <w:tcPr>
             <w:tcW w:w="3118" w:type="dxa"/>
-            <w:shd w:val="clear" w:fill="F3F6F9"/>
+            <w:shd w:val="clear" w:fill="FFFFFF"/>
             <w:vAlign w:val="top"/>
           </w:tcPr>
           <w:p>
@@ -32273,7 +32337,7 @@
         <w:tc>
           <w:tcPr>
             <w:tcW w:w="4289" w:type="dxa"/>
-            <w:shd w:val="clear" w:fill="F3F6F9"/>
+            <w:shd w:val="clear" w:fill="FFFFFF"/>
             <w:vAlign w:val="top"/>
           </w:tcPr>
           <w:p>
@@ -32297,7 +32361,7 @@
         <w:tc>
           <w:tcPr>
             <w:tcW w:w="2339" w:type="dxa"/>
-            <w:shd w:val="clear" w:fill="FFFFFF"/>
+            <w:shd w:val="clear" w:fill="F3F6F9"/>
             <w:vAlign w:val="top"/>
           </w:tcPr>
           <w:p>
@@ -32317,7 +32381,7 @@
         <w:tc>
           <w:tcPr>
             <w:tcW w:w="3118" w:type="dxa"/>
-            <w:shd w:val="clear" w:fill="FFFFFF"/>
+            <w:shd w:val="clear" w:fill="F3F6F9"/>
             <w:vAlign w:val="top"/>
           </w:tcPr>
           <w:p>
@@ -32427,7 +32491,7 @@
         <w:tc>
           <w:tcPr>
             <w:tcW w:w="4289" w:type="dxa"/>
-            <w:shd w:val="clear" w:fill="FFFFFF"/>
+            <w:shd w:val="clear" w:fill="F3F6F9"/>
             <w:vAlign w:val="top"/>
           </w:tcPr>
           <w:p>
@@ -32451,7 +32515,7 @@
         <w:tc>
           <w:tcPr>
             <w:tcW w:w="2339" w:type="dxa"/>
-            <w:shd w:val="clear" w:fill="F3F6F9"/>
+            <w:shd w:val="clear" w:fill="FFFFFF"/>
             <w:vAlign w:val="top"/>
           </w:tcPr>
           <w:p>
@@ -32471,7 +32535,7 @@
         <w:tc>
           <w:tcPr>
             <w:tcW w:w="3118" w:type="dxa"/>
-            <w:shd w:val="clear" w:fill="F3F6F9"/>
+            <w:shd w:val="clear" w:fill="FFFFFF"/>
             <w:vAlign w:val="top"/>
           </w:tcPr>
           <w:p>
@@ -32536,7 +32600,7 @@
         <w:tc>
           <w:tcPr>
             <w:tcW w:w="4289" w:type="dxa"/>
-            <w:shd w:val="clear" w:fill="F3F6F9"/>
+            <w:shd w:val="clear" w:fill="FFFFFF"/>
             <w:vAlign w:val="top"/>
           </w:tcPr>
           <w:p>
@@ -32560,7 +32624,7 @@
         <w:tc>
           <w:tcPr>
             <w:tcW w:w="2339" w:type="dxa"/>
-            <w:shd w:val="clear" w:fill="FFFFFF"/>
+            <w:shd w:val="clear" w:fill="F3F6F9"/>
             <w:vAlign w:val="top"/>
           </w:tcPr>
           <w:p>
@@ -32580,7 +32644,7 @@
         <w:tc>
           <w:tcPr>
             <w:tcW w:w="3118" w:type="dxa"/>
-            <w:shd w:val="clear" w:fill="FFFFFF"/>
+            <w:shd w:val="clear" w:fill="F3F6F9"/>
             <w:vAlign w:val="top"/>
           </w:tcPr>
           <w:p>
@@ -32600,7 +32664,7 @@
         <w:tc>
           <w:tcPr>
             <w:tcW w:w="4289" w:type="dxa"/>
-            <w:shd w:val="clear" w:fill="FFFFFF"/>
+            <w:shd w:val="clear" w:fill="F3F6F9"/>
             <w:vAlign w:val="top"/>
           </w:tcPr>
           <w:p>
@@ -32624,7 +32688,7 @@
         <w:tc>
           <w:tcPr>
             <w:tcW w:w="2339" w:type="dxa"/>
-            <w:shd w:val="clear" w:fill="F3F6F9"/>
+            <w:shd w:val="clear" w:fill="FFFFFF"/>
             <w:vAlign w:val="top"/>
           </w:tcPr>
           <w:p>
@@ -32644,7 +32708,7 @@
         <w:tc>
           <w:tcPr>
             <w:tcW w:w="3118" w:type="dxa"/>
-            <w:shd w:val="clear" w:fill="F3F6F9"/>
+            <w:shd w:val="clear" w:fill="FFFFFF"/>
             <w:vAlign w:val="top"/>
           </w:tcPr>
           <w:p>
@@ -32663,7 +32727,7 @@
         <w:tc>
           <w:tcPr>
             <w:tcW w:w="4289" w:type="dxa"/>
-            <w:shd w:val="clear" w:fill="F3F6F9"/>
+            <w:shd w:val="clear" w:fill="FFFFFF"/>
             <w:vAlign w:val="top"/>
           </w:tcPr>
           <w:p>
@@ -32687,7 +32751,7 @@
         <w:tc>
           <w:tcPr>
             <w:tcW w:w="2339" w:type="dxa"/>
-            <w:shd w:val="clear" w:fill="FFFFFF"/>
+            <w:shd w:val="clear" w:fill="F3F6F9"/>
             <w:vAlign w:val="top"/>
           </w:tcPr>
           <w:p>
@@ -32707,7 +32771,7 @@
         <w:tc>
           <w:tcPr>
             <w:tcW w:w="3118" w:type="dxa"/>
-            <w:shd w:val="clear" w:fill="FFFFFF"/>
+            <w:shd w:val="clear" w:fill="F3F6F9"/>
             <w:vAlign w:val="top"/>
           </w:tcPr>
           <w:p>
@@ -32727,7 +32791,7 @@
         <w:tc>
           <w:tcPr>
             <w:tcW w:w="4289" w:type="dxa"/>
-            <w:shd w:val="clear" w:fill="FFFFFF"/>
+            <w:shd w:val="clear" w:fill="F3F6F9"/>
             <w:vAlign w:val="top"/>
           </w:tcPr>
           <w:p>
@@ -32751,7 +32815,7 @@
         <w:tc>
           <w:tcPr>
             <w:tcW w:w="2339" w:type="dxa"/>
-            <w:shd w:val="clear" w:fill="F3F6F9"/>
+            <w:shd w:val="clear" w:fill="FFFFFF"/>
             <w:vAlign w:val="top"/>
           </w:tcPr>
           <w:p>
@@ -32771,13 +32835,73 @@
         <w:tc>
           <w:tcPr>
             <w:tcW w:w="3118" w:type="dxa"/>
-            <w:shd w:val="clear" w:fill="F3F6F9"/>
-            <w:vAlign w:val="top"/>
-          </w:tcPr>
-          <w:p>
-            <w:pPr>
-              <w:pStyle w:val="TableText"/>
-            </w:pPr>
+            <w:shd w:val="clear" w:fill="FFFFFF"/>
+            <w:vAlign w:val="top"/>
+          </w:tcPr>
+          <w:p>
+            <w:pPr>
+              <w:pStyle w:val="TableText"/>
+            </w:pPr>
+            <w:r>
+              <w:rPr>
+                <w:rFonts w:ascii="Consolas" w:hAnsi="Consolas"/>
+                <w:sz w:val="19"/>
+                <w:color w:val="172C43"/>
+              </w:rPr>
+              <w:t xml:space="preserve">other</w:t>
+            </w:r>
+            <w:r>
+              <w:rPr>
+                <w:sz w:val="19"/>
+                <w:color w:val="172C43"/>
+              </w:rPr>
+              <w:t xml:space="preserve">, </w:t>
+            </w:r>
+            <w:r>
+              <w:rPr>
+                <w:rFonts w:ascii="Consolas" w:hAnsi="Consolas"/>
+                <w:sz w:val="19"/>
+                <w:color w:val="172C43"/>
+              </w:rPr>
+              <w:t xml:space="preserve">motionAllowed</w:t>
+            </w:r>
+            <w:r>
+              <w:rPr>
+                <w:sz w:val="19"/>
+                <w:color w:val="172C43"/>
+              </w:rPr>
+              <w:t xml:space="preserve">, </w:t>
+            </w:r>
+            <w:r>
+              <w:rPr>
+                <w:rFonts w:ascii="Consolas" w:hAnsi="Consolas"/>
+                <w:sz w:val="19"/>
+                <w:color w:val="172C43"/>
+              </w:rPr>
+              <w:t xml:space="preserve">BrandMark</w:t>
+            </w:r>
+            <w:r>
+              <w:rPr>
+                <w:sz w:val="19"/>
+                <w:color w:val="172C43"/>
+              </w:rPr>
+              <w:t xml:space="preserve">, </w:t>
+            </w:r>
+            <w:r>
+              <w:rPr>
+                <w:rFonts w:ascii="Consolas" w:hAnsi="Consolas"/>
+                <w:sz w:val="19"/>
+                <w:color w:val="172C43"/>
+              </w:rPr>
+              <w:t xml:space="preserve">Brand</w:t>
+            </w:r>
+            <w:r>
+              <w:rPr>
+                <w:sz w:val="19"/>
+                <w:color w:val="172C43"/>
+              </w:rPr>
+              <w:t xml:space="preserve">, </w:t>
+            </w:r>
             <w:r>
               <w:rPr>
                 <w:rFonts w:ascii="Consolas" w:hAnsi="Consolas"/>
@@ -32786,24 +32910,39 @@
               </w:rPr>
               <w:t xml:space="preserve">Login</w:t>
             </w:r>
+            <w:r>
+              <w:rPr>
+                <w:sz w:val="19"/>
+                <w:color w:val="172C43"/>
+              </w:rPr>
+              <w:t xml:space="preserve">, </w:t>
+            </w:r>
+            <w:r>
+              <w:rPr>
+                <w:rFonts w:ascii="Consolas" w:hAnsi="Consolas"/>
+                <w:sz w:val="19"/>
+                <w:color w:val="172C43"/>
+              </w:rPr>
+              <w:t xml:space="preserve">choosePortal</w:t>
+            </w:r>
           </w:p>
         </w:tc>
         <w:tc>
           <w:tcPr>
             <w:tcW w:w="4289" w:type="dxa"/>
-            <w:shd w:val="clear" w:fill="F3F6F9"/>
-            <w:vAlign w:val="top"/>
-          </w:tcPr>
-          <w:p>
-            <w:pPr>
-              <w:pStyle w:val="TableText"/>
-            </w:pPr>
-            <w:r>
-              <w:rPr>
-                <w:sz w:val="19"/>
-                <w:color w:val="172C43"/>
-              </w:rPr>
-              <w:t xml:space="preserve">Portal toggle, email suggestions, password visibility and recovery.</w:t>
+            <w:shd w:val="clear" w:fill="FFFFFF"/>
+            <w:vAlign w:val="top"/>
+          </w:tcPr>
+          <w:p>
+            <w:pPr>
+              <w:pStyle w:val="TableText"/>
+            </w:pPr>
+            <w:r>
+              <w:rPr>
+                <w:sz w:val="19"/>
+                <w:color w:val="172C43"/>
+              </w:rPr>
+              <w:t xml:space="preserve">Glass Admin/Agent sign-in with sliding panels, centre switch, portal role check, MFA step and password reset.</w:t>
             </w:r>
           </w:p>
         </w:tc>
@@ -32815,7 +32954,7 @@
         <w:tc>
           <w:tcPr>
             <w:tcW w:w="2339" w:type="dxa"/>
-            <w:shd w:val="clear" w:fill="FFFFFF"/>
+            <w:shd w:val="clear" w:fill="F3F6F9"/>
             <w:vAlign w:val="top"/>
           </w:tcPr>
           <w:p>
@@ -32835,7 +32974,7 @@
         <w:tc>
           <w:tcPr>
             <w:tcW w:w="3118" w:type="dxa"/>
-            <w:shd w:val="clear" w:fill="FFFFFF"/>
+            <w:shd w:val="clear" w:fill="F3F6F9"/>
             <w:vAlign w:val="top"/>
           </w:tcPr>
           <w:p>
@@ -33080,7 +33219,7 @@
         <w:tc>
           <w:tcPr>
             <w:tcW w:w="4289" w:type="dxa"/>
-            <w:shd w:val="clear" w:fill="FFFFFF"/>
+            <w:shd w:val="clear" w:fill="F3F6F9"/>
             <w:vAlign w:val="top"/>
           </w:tcPr>
           <w:p>
@@ -33104,7 +33243,7 @@
         <w:tc>
           <w:tcPr>
             <w:tcW w:w="2339" w:type="dxa"/>
-            <w:shd w:val="clear" w:fill="F3F6F9"/>
+            <w:shd w:val="clear" w:fill="FFFFFF"/>
             <w:vAlign w:val="top"/>
           </w:tcPr>
           <w:p>
@@ -33124,7 +33263,7 @@
         <w:tc>
           <w:tcPr>
             <w:tcW w:w="3118" w:type="dxa"/>
-            <w:shd w:val="clear" w:fill="F3F6F9"/>
+            <w:shd w:val="clear" w:fill="FFFFFF"/>
             <w:vAlign w:val="top"/>
           </w:tcPr>
           <w:p>
@@ -33159,7 +33298,7 @@
         <w:tc>
           <w:tcPr>
             <w:tcW w:w="4289" w:type="dxa"/>
-            <w:shd w:val="clear" w:fill="F3F6F9"/>
+            <w:shd w:val="clear" w:fill="FFFFFF"/>
             <w:vAlign w:val="top"/>
           </w:tcPr>
           <w:p>
@@ -33183,7 +33322,7 @@
         <w:tc>
           <w:tcPr>
             <w:tcW w:w="2339" w:type="dxa"/>
-            <w:shd w:val="clear" w:fill="FFFFFF"/>
+            <w:shd w:val="clear" w:fill="F3F6F9"/>
             <w:vAlign w:val="top"/>
           </w:tcPr>
           <w:p>
@@ -33203,7 +33342,7 @@
         <w:tc>
           <w:tcPr>
             <w:tcW w:w="3118" w:type="dxa"/>
-            <w:shd w:val="clear" w:fill="FFFFFF"/>
+            <w:shd w:val="clear" w:fill="F3F6F9"/>
             <w:vAlign w:val="top"/>
           </w:tcPr>
           <w:p>
@@ -33283,7 +33422,7 @@
         <w:tc>
           <w:tcPr>
             <w:tcW w:w="4289" w:type="dxa"/>
-            <w:shd w:val="clear" w:fill="FFFFFF"/>
+            <w:shd w:val="clear" w:fill="F3F6F9"/>
             <w:vAlign w:val="top"/>
           </w:tcPr>
           <w:p>
@@ -33307,7 +33446,7 @@
         <w:tc>
           <w:tcPr>
             <w:tcW w:w="2339" w:type="dxa"/>
-            <w:shd w:val="clear" w:fill="F3F6F9"/>
+            <w:shd w:val="clear" w:fill="FFFFFF"/>
             <w:vAlign w:val="top"/>
           </w:tcPr>
           <w:p>
@@ -33327,7 +33466,7 @@
         <w:tc>
           <w:tcPr>
             <w:tcW w:w="3118" w:type="dxa"/>
-            <w:shd w:val="clear" w:fill="F3F6F9"/>
+            <w:shd w:val="clear" w:fill="FFFFFF"/>
             <w:vAlign w:val="top"/>
           </w:tcPr>
           <w:p>
@@ -33347,7 +33486,7 @@
         <w:tc>
           <w:tcPr>
             <w:tcW w:w="4289" w:type="dxa"/>
-            <w:shd w:val="clear" w:fill="F3F6F9"/>
+            <w:shd w:val="clear" w:fill="FFFFFF"/>
             <w:vAlign w:val="top"/>
           </w:tcPr>
           <w:p>
@@ -33371,7 +33510,7 @@
         <w:tc>
           <w:tcPr>
             <w:tcW w:w="2339" w:type="dxa"/>
-            <w:shd w:val="clear" w:fill="FFFFFF"/>
+            <w:shd w:val="clear" w:fill="F3F6F9"/>
             <w:vAlign w:val="top"/>
           </w:tcPr>
           <w:p>
@@ -33391,7 +33530,7 @@
         <w:tc>
           <w:tcPr>
             <w:tcW w:w="3118" w:type="dxa"/>
-            <w:shd w:val="clear" w:fill="FFFFFF"/>
+            <w:shd w:val="clear" w:fill="F3F6F9"/>
             <w:vAlign w:val="top"/>
           </w:tcPr>
           <w:p>
@@ -33411,7 +33550,7 @@
         <w:tc>
           <w:tcPr>
             <w:tcW w:w="4289" w:type="dxa"/>
-            <w:shd w:val="clear" w:fill="FFFFFF"/>
+            <w:shd w:val="clear" w:fill="F3F6F9"/>
             <w:vAlign w:val="top"/>
           </w:tcPr>
           <w:p>
@@ -33435,7 +33574,7 @@
         <w:tc>
           <w:tcPr>
             <w:tcW w:w="2339" w:type="dxa"/>
-            <w:shd w:val="clear" w:fill="F3F6F9"/>
+            <w:shd w:val="clear" w:fill="FFFFFF"/>
             <w:vAlign w:val="top"/>
           </w:tcPr>
           <w:p>
@@ -33455,7 +33594,7 @@
         <w:tc>
           <w:tcPr>
             <w:tcW w:w="3118" w:type="dxa"/>
-            <w:shd w:val="clear" w:fill="F3F6F9"/>
+            <w:shd w:val="clear" w:fill="FFFFFF"/>
             <w:vAlign w:val="top"/>
           </w:tcPr>
           <w:p>
@@ -33535,7 +33674,7 @@
         <w:tc>
           <w:tcPr>
             <w:tcW w:w="4289" w:type="dxa"/>
-            <w:shd w:val="clear" w:fill="F3F6F9"/>
+            <w:shd w:val="clear" w:fill="FFFFFF"/>
             <w:vAlign w:val="top"/>
           </w:tcPr>
           <w:p>
@@ -33559,7 +33698,7 @@
         <w:tc>
           <w:tcPr>
             <w:tcW w:w="2339" w:type="dxa"/>
-            <w:shd w:val="clear" w:fill="FFFFFF"/>
+            <w:shd w:val="clear" w:fill="F3F6F9"/>
             <w:vAlign w:val="top"/>
           </w:tcPr>
           <w:p>
@@ -33579,7 +33718,7 @@
         <w:tc>
           <w:tcPr>
             <w:tcW w:w="3118" w:type="dxa"/>
-            <w:shd w:val="clear" w:fill="FFFFFF"/>
+            <w:shd w:val="clear" w:fill="F3F6F9"/>
             <w:vAlign w:val="top"/>
           </w:tcPr>
           <w:p>
@@ -33614,7 +33753,7 @@
         <w:tc>
           <w:tcPr>
             <w:tcW w:w="4289" w:type="dxa"/>
-            <w:shd w:val="clear" w:fill="FFFFFF"/>
+            <w:shd w:val="clear" w:fill="F3F6F9"/>
             <w:vAlign w:val="top"/>
           </w:tcPr>
           <w:p>
@@ -33638,7 +33777,7 @@
         <w:tc>
           <w:tcPr>
             <w:tcW w:w="2339" w:type="dxa"/>
-            <w:shd w:val="clear" w:fill="F3F6F9"/>
+            <w:shd w:val="clear" w:fill="FFFFFF"/>
             <w:vAlign w:val="top"/>
           </w:tcPr>
           <w:p>
@@ -33658,7 +33797,7 @@
         <w:tc>
           <w:tcPr>
             <w:tcW w:w="3118" w:type="dxa"/>
-            <w:shd w:val="clear" w:fill="F3F6F9"/>
+            <w:shd w:val="clear" w:fill="FFFFFF"/>
             <w:vAlign w:val="top"/>
           </w:tcPr>
           <w:p>
@@ -33753,7 +33892,7 @@
         <w:tc>
           <w:tcPr>
             <w:tcW w:w="4289" w:type="dxa"/>
-            <w:shd w:val="clear" w:fill="F3F6F9"/>
+            <w:shd w:val="clear" w:fill="FFFFFF"/>
             <w:vAlign w:val="top"/>
           </w:tcPr>
           <w:p>
@@ -33777,7 +33916,7 @@
         <w:tc>
           <w:tcPr>
             <w:tcW w:w="2339" w:type="dxa"/>
-            <w:shd w:val="clear" w:fill="FFFFFF"/>
+            <w:shd w:val="clear" w:fill="F3F6F9"/>
             <w:vAlign w:val="top"/>
           </w:tcPr>
           <w:p>
@@ -33797,7 +33936,7 @@
         <w:tc>
           <w:tcPr>
             <w:tcW w:w="3118" w:type="dxa"/>
-            <w:shd w:val="clear" w:fill="FFFFFF"/>
+            <w:shd w:val="clear" w:fill="F3F6F9"/>
             <w:vAlign w:val="top"/>
           </w:tcPr>
           <w:p>
@@ -33922,7 +34061,7 @@
         <w:tc>
           <w:tcPr>
             <w:tcW w:w="4289" w:type="dxa"/>
-            <w:shd w:val="clear" w:fill="FFFFFF"/>
+            <w:shd w:val="clear" w:fill="F3F6F9"/>
             <w:vAlign w:val="top"/>
           </w:tcPr>
           <w:p>
@@ -33946,7 +34085,7 @@
         <w:tc>
           <w:tcPr>
             <w:tcW w:w="2339" w:type="dxa"/>
-            <w:shd w:val="clear" w:fill="F3F6F9"/>
+            <w:shd w:val="clear" w:fill="FFFFFF"/>
             <w:vAlign w:val="top"/>
           </w:tcPr>
           <w:p>
@@ -33966,7 +34105,7 @@
         <w:tc>
           <w:tcPr>
             <w:tcW w:w="3118" w:type="dxa"/>
-            <w:shd w:val="clear" w:fill="F3F6F9"/>
+            <w:shd w:val="clear" w:fill="FFFFFF"/>
             <w:vAlign w:val="top"/>
           </w:tcPr>
           <w:p>
@@ -34031,7 +34170,7 @@
         <w:tc>
           <w:tcPr>
             <w:tcW w:w="4289" w:type="dxa"/>
-            <w:shd w:val="clear" w:fill="F3F6F9"/>
+            <w:shd w:val="clear" w:fill="FFFFFF"/>
             <w:vAlign w:val="top"/>
           </w:tcPr>
           <w:p>
@@ -34055,7 +34194,7 @@
         <w:tc>
           <w:tcPr>
             <w:tcW w:w="2339" w:type="dxa"/>
-            <w:shd w:val="clear" w:fill="FFFFFF"/>
+            <w:shd w:val="clear" w:fill="F3F6F9"/>
             <w:vAlign w:val="top"/>
           </w:tcPr>
           <w:p>
@@ -34075,7 +34214,7 @@
         <w:tc>
           <w:tcPr>
             <w:tcW w:w="3118" w:type="dxa"/>
-            <w:shd w:val="clear" w:fill="FFFFFF"/>
+            <w:shd w:val="clear" w:fill="F3F6F9"/>
             <w:vAlign w:val="top"/>
           </w:tcPr>
           <w:p>
@@ -34125,7 +34264,7 @@
         <w:tc>
           <w:tcPr>
             <w:tcW w:w="4289" w:type="dxa"/>
-            <w:shd w:val="clear" w:fill="FFFFFF"/>
+            <w:shd w:val="clear" w:fill="F3F6F9"/>
             <w:vAlign w:val="top"/>
           </w:tcPr>
           <w:p>
@@ -34149,7 +34288,7 @@
         <w:tc>
           <w:tcPr>
             <w:tcW w:w="2339" w:type="dxa"/>
-            <w:shd w:val="clear" w:fill="F3F6F9"/>
+            <w:shd w:val="clear" w:fill="FFFFFF"/>
             <w:vAlign w:val="top"/>
           </w:tcPr>
           <w:p>
@@ -34169,7 +34308,7 @@
         <w:tc>
           <w:tcPr>
             <w:tcW w:w="3118" w:type="dxa"/>
-            <w:shd w:val="clear" w:fill="F3F6F9"/>
+            <w:shd w:val="clear" w:fill="FFFFFF"/>
             <w:vAlign w:val="top"/>
           </w:tcPr>
           <w:p>
@@ -34219,7 +34358,7 @@
         <w:tc>
           <w:tcPr>
             <w:tcW w:w="4289" w:type="dxa"/>
-            <w:shd w:val="clear" w:fill="F3F6F9"/>
+            <w:shd w:val="clear" w:fill="FFFFFF"/>
             <w:vAlign w:val="top"/>
           </w:tcPr>
           <w:p>
@@ -34243,7 +34382,7 @@
         <w:tc>
           <w:tcPr>
             <w:tcW w:w="2339" w:type="dxa"/>
-            <w:shd w:val="clear" w:fill="FFFFFF"/>
+            <w:shd w:val="clear" w:fill="F3F6F9"/>
             <w:vAlign w:val="top"/>
           </w:tcPr>
           <w:p>
@@ -34263,7 +34402,7 @@
         <w:tc>
           <w:tcPr>
             <w:tcW w:w="3118" w:type="dxa"/>
-            <w:shd w:val="clear" w:fill="FFFFFF"/>
+            <w:shd w:val="clear" w:fill="F3F6F9"/>
             <w:vAlign w:val="top"/>
           </w:tcPr>
           <w:p>
@@ -34448,7 +34587,7 @@
         <w:tc>
           <w:tcPr>
             <w:tcW w:w="4289" w:type="dxa"/>
-            <w:shd w:val="clear" w:fill="FFFFFF"/>
+            <w:shd w:val="clear" w:fill="F3F6F9"/>
             <w:vAlign w:val="top"/>
           </w:tcPr>
           <w:p>
@@ -34472,7 +34611,7 @@
         <w:tc>
           <w:tcPr>
             <w:tcW w:w="2339" w:type="dxa"/>
-            <w:shd w:val="clear" w:fill="F3F6F9"/>
+            <w:shd w:val="clear" w:fill="FFFFFF"/>
             <w:vAlign w:val="top"/>
           </w:tcPr>
           <w:p>
@@ -34492,7 +34631,7 @@
         <w:tc>
           <w:tcPr>
             <w:tcW w:w="3118" w:type="dxa"/>
-            <w:shd w:val="clear" w:fill="F3F6F9"/>
+            <w:shd w:val="clear" w:fill="FFFFFF"/>
             <w:vAlign w:val="top"/>
           </w:tcPr>
           <w:p>
@@ -34527,7 +34666,7 @@
         <w:tc>
           <w:tcPr>
             <w:tcW w:w="4289" w:type="dxa"/>
-            <w:shd w:val="clear" w:fill="F3F6F9"/>
+            <w:shd w:val="clear" w:fill="FFFFFF"/>
             <w:vAlign w:val="top"/>
           </w:tcPr>
           <w:p>
@@ -34551,7 +34690,7 @@
         <w:tc>
           <w:tcPr>
             <w:tcW w:w="2339" w:type="dxa"/>
-            <w:shd w:val="clear" w:fill="FFFFFF"/>
+            <w:shd w:val="clear" w:fill="F3F6F9"/>
             <w:vAlign w:val="top"/>
           </w:tcPr>
           <w:p>
@@ -34571,7 +34710,7 @@
         <w:tc>
           <w:tcPr>
             <w:tcW w:w="3118" w:type="dxa"/>
-            <w:shd w:val="clear" w:fill="FFFFFF"/>
+            <w:shd w:val="clear" w:fill="F3F6F9"/>
             <w:vAlign w:val="top"/>
           </w:tcPr>
           <w:p>
@@ -34621,7 +34760,7 @@
         <w:tc>
           <w:tcPr>
             <w:tcW w:w="4289" w:type="dxa"/>
-            <w:shd w:val="clear" w:fill="FFFFFF"/>
+            <w:shd w:val="clear" w:fill="F3F6F9"/>
             <w:vAlign w:val="top"/>
           </w:tcPr>
           <w:p>
@@ -34645,7 +34784,7 @@
         <w:tc>
           <w:tcPr>
             <w:tcW w:w="2339" w:type="dxa"/>
-            <w:shd w:val="clear" w:fill="F3F6F9"/>
+            <w:shd w:val="clear" w:fill="FFFFFF"/>
             <w:vAlign w:val="top"/>
           </w:tcPr>
           <w:p>
@@ -34665,7 +34804,7 @@
         <w:tc>
           <w:tcPr>
             <w:tcW w:w="3118" w:type="dxa"/>
-            <w:shd w:val="clear" w:fill="F3F6F9"/>
+            <w:shd w:val="clear" w:fill="FFFFFF"/>
             <w:vAlign w:val="top"/>
           </w:tcPr>
           <w:p>
@@ -34685,7 +34824,7 @@
         <w:tc>
           <w:tcPr>
             <w:tcW w:w="4289" w:type="dxa"/>
-            <w:shd w:val="clear" w:fill="F3F6F9"/>
+            <w:shd w:val="clear" w:fill="FFFFFF"/>
             <w:vAlign w:val="top"/>
           </w:tcPr>
           <w:p>
@@ -34709,7 +34848,7 @@
         <w:tc>
           <w:tcPr>
             <w:tcW w:w="2339" w:type="dxa"/>
-            <w:shd w:val="clear" w:fill="FFFFFF"/>
+            <w:shd w:val="clear" w:fill="F3F6F9"/>
             <w:vAlign w:val="top"/>
           </w:tcPr>
           <w:p>
@@ -34729,7 +34868,7 @@
         <w:tc>
           <w:tcPr>
             <w:tcW w:w="3118" w:type="dxa"/>
-            <w:shd w:val="clear" w:fill="FFFFFF"/>
+            <w:shd w:val="clear" w:fill="F3F6F9"/>
             <w:vAlign w:val="top"/>
           </w:tcPr>
           <w:p>
@@ -34749,7 +34888,7 @@
         <w:tc>
           <w:tcPr>
             <w:tcW w:w="4289" w:type="dxa"/>
-            <w:shd w:val="clear" w:fill="FFFFFF"/>
+            <w:shd w:val="clear" w:fill="F3F6F9"/>
             <w:vAlign w:val="top"/>
           </w:tcPr>
           <w:p>
@@ -34773,7 +34912,7 @@
         <w:tc>
           <w:tcPr>
             <w:tcW w:w="2339" w:type="dxa"/>
-            <w:shd w:val="clear" w:fill="F3F6F9"/>
+            <w:shd w:val="clear" w:fill="FFFFFF"/>
             <w:vAlign w:val="top"/>
           </w:tcPr>
           <w:p>
@@ -34793,7 +34932,7 @@
         <w:tc>
           <w:tcPr>
             <w:tcW w:w="3118" w:type="dxa"/>
-            <w:shd w:val="clear" w:fill="F3F6F9"/>
+            <w:shd w:val="clear" w:fill="FFFFFF"/>
             <w:vAlign w:val="top"/>
           </w:tcPr>
           <w:p>
@@ -34843,7 +34982,7 @@
         <w:tc>
           <w:tcPr>
             <w:tcW w:w="4289" w:type="dxa"/>
-            <w:shd w:val="clear" w:fill="F3F6F9"/>
+            <w:shd w:val="clear" w:fill="FFFFFF"/>
             <w:vAlign w:val="top"/>
           </w:tcPr>
           <w:p>
@@ -34867,7 +35006,7 @@
         <w:tc>
           <w:tcPr>
             <w:tcW w:w="2339" w:type="dxa"/>
-            <w:shd w:val="clear" w:fill="FFFFFF"/>
+            <w:shd w:val="clear" w:fill="F3F6F9"/>
             <w:vAlign w:val="top"/>
           </w:tcPr>
           <w:p>
@@ -34887,7 +35026,7 @@
         <w:tc>
           <w:tcPr>
             <w:tcW w:w="3118" w:type="dxa"/>
-            <w:shd w:val="clear" w:fill="FFFFFF"/>
+            <w:shd w:val="clear" w:fill="F3F6F9"/>
             <w:vAlign w:val="top"/>
           </w:tcPr>
           <w:p>
@@ -34906,7 +35045,7 @@
         <w:tc>
           <w:tcPr>
             <w:tcW w:w="4289" w:type="dxa"/>
-            <w:shd w:val="clear" w:fill="FFFFFF"/>
+            <w:shd w:val="clear" w:fill="F3F6F9"/>
             <w:vAlign w:val="top"/>
           </w:tcPr>
           <w:p>
@@ -34930,7 +35069,7 @@
         <w:tc>
           <w:tcPr>
             <w:tcW w:w="2339" w:type="dxa"/>
-            <w:shd w:val="clear" w:fill="F3F6F9"/>
+            <w:shd w:val="clear" w:fill="FFFFFF"/>
             <w:vAlign w:val="top"/>
           </w:tcPr>
           <w:p>
@@ -34950,7 +35089,7 @@
         <w:tc>
           <w:tcPr>
             <w:tcW w:w="3118" w:type="dxa"/>
-            <w:shd w:val="clear" w:fill="F3F6F9"/>
+            <w:shd w:val="clear" w:fill="FFFFFF"/>
             <w:vAlign w:val="top"/>
           </w:tcPr>
           <w:p>
@@ -34969,7 +35108,7 @@
         <w:tc>
           <w:tcPr>
             <w:tcW w:w="4289" w:type="dxa"/>
-            <w:shd w:val="clear" w:fill="F3F6F9"/>
+            <w:shd w:val="clear" w:fill="FFFFFF"/>
             <w:vAlign w:val="top"/>
           </w:tcPr>
           <w:p>
@@ -34993,7 +35132,7 @@
         <w:tc>
           <w:tcPr>
             <w:tcW w:w="2339" w:type="dxa"/>
-            <w:shd w:val="clear" w:fill="FFFFFF"/>
+            <w:shd w:val="clear" w:fill="F3F6F9"/>
             <w:vAlign w:val="top"/>
           </w:tcPr>
           <w:p>
@@ -35013,7 +35152,7 @@
         <w:tc>
           <w:tcPr>
             <w:tcW w:w="3118" w:type="dxa"/>
-            <w:shd w:val="clear" w:fill="FFFFFF"/>
+            <w:shd w:val="clear" w:fill="F3F6F9"/>
             <w:vAlign w:val="top"/>
           </w:tcPr>
           <w:p>
@@ -35033,7 +35172,7 @@
         <w:tc>
           <w:tcPr>
             <w:tcW w:w="4289" w:type="dxa"/>
-            <w:shd w:val="clear" w:fill="FFFFFF"/>
+            <w:shd w:val="clear" w:fill="F3F6F9"/>
             <w:vAlign w:val="top"/>
           </w:tcPr>
           <w:p>
@@ -35057,7 +35196,7 @@
         <w:tc>
           <w:tcPr>
             <w:tcW w:w="2339" w:type="dxa"/>
-            <w:shd w:val="clear" w:fill="F3F6F9"/>
+            <w:shd w:val="clear" w:fill="FFFFFF"/>
             <w:vAlign w:val="top"/>
           </w:tcPr>
           <w:p>
@@ -35077,7 +35216,7 @@
         <w:tc>
           <w:tcPr>
             <w:tcW w:w="3118" w:type="dxa"/>
-            <w:shd w:val="clear" w:fill="F3F6F9"/>
+            <w:shd w:val="clear" w:fill="FFFFFF"/>
             <w:vAlign w:val="top"/>
           </w:tcPr>
           <w:p>
@@ -35262,7 +35401,7 @@
         <w:tc>
           <w:tcPr>
             <w:tcW w:w="4289" w:type="dxa"/>
-            <w:shd w:val="clear" w:fill="F3F6F9"/>
+            <w:shd w:val="clear" w:fill="FFFFFF"/>
             <w:vAlign w:val="top"/>
           </w:tcPr>
           <w:p>
@@ -35286,7 +35425,7 @@
         <w:tc>
           <w:tcPr>
             <w:tcW w:w="2339" w:type="dxa"/>
-            <w:shd w:val="clear" w:fill="FFFFFF"/>
+            <w:shd w:val="clear" w:fill="F3F6F9"/>
             <w:vAlign w:val="top"/>
           </w:tcPr>
           <w:p>
@@ -35306,7 +35445,7 @@
         <w:tc>
           <w:tcPr>
             <w:tcW w:w="3118" w:type="dxa"/>
-            <w:shd w:val="clear" w:fill="FFFFFF"/>
+            <w:shd w:val="clear" w:fill="F3F6F9"/>
             <w:vAlign w:val="top"/>
           </w:tcPr>
           <w:p>
@@ -35401,7 +35540,7 @@
         <w:tc>
           <w:tcPr>
             <w:tcW w:w="4289" w:type="dxa"/>
-            <w:shd w:val="clear" w:fill="FFFFFF"/>
+            <w:shd w:val="clear" w:fill="F3F6F9"/>
             <w:vAlign w:val="top"/>
           </w:tcPr>
           <w:p>

</xml_diff>

<commit_message>
Secure password reset: remove from agent portal, restrict to registered active admins
</commit_message>
<xml_diff>
--- a/docs/HD_Marketing_CRM_Complete_Documentation.docx
+++ b/docs/HD_Marketing_CRM_Complete_Documentation.docx
@@ -24240,7 +24240,7 @@
       <w:pPr/>
       <w:r>
         <w:rPr/>
-        <w:t xml:space="preserve">The current inventory covers 194 JavaScript/JSX modules, 555 explicitly named JavaScript functions/helpers (counted per module), and 236 latest PostgreSQL function definitions.</w:t>
+        <w:t xml:space="preserve">The current inventory covers 194 JavaScript/JSX modules, 558 explicitly named JavaScript functions/helpers (counted per module), and 236 latest PostgreSQL function definitions.</w:t>
       </w:r>
     </w:p>
     <w:p>
@@ -28076,6 +28076,36 @@
                 <w:color w:val="172C43"/>
               </w:rPr>
               <w:t xml:space="preserve">close</w:t>
+            </w:r>
+            <w:r>
+              <w:rPr>
+                <w:sz w:val="19"/>
+                <w:color w:val="172C43"/>
+              </w:rPr>
+              <w:t xml:space="preserve">, </w:t>
+            </w:r>
+            <w:r>
+              <w:rPr>
+                <w:rFonts w:ascii="Consolas" w:hAnsi="Consolas"/>
+                <w:sz w:val="19"/>
+                <w:color w:val="172C43"/>
+              </w:rPr>
+              <w:t xml:space="preserve">outside</w:t>
+            </w:r>
+            <w:r>
+              <w:rPr>
+                <w:sz w:val="19"/>
+                <w:color w:val="172C43"/>
+              </w:rPr>
+              <w:t xml:space="preserve">, </w:t>
+            </w:r>
+            <w:r>
+              <w:rPr>
+                <w:rFonts w:ascii="Consolas" w:hAnsi="Consolas"/>
+                <w:sz w:val="19"/>
+                <w:color w:val="172C43"/>
+              </w:rPr>
+              <w:t xml:space="preserve">inside</w:t>
             </w:r>
             <w:r>
               <w:rPr>
@@ -37033,10 +37063,11 @@
             </w:pPr>
             <w:r>
               <w:rPr>
-                <w:sz w:val="19"/>
-                <w:color w:val="172C43"/>
-              </w:rPr>
-              <w:t xml:space="preserve">Startup, shared constants or compatibility export</w:t>
+                <w:rFonts w:ascii="Consolas" w:hAnsi="Consolas"/>
+                <w:sz w:val="19"/>
+                <w:color w:val="172C43"/>
+              </w:rPr>
+              <w:t xml:space="preserve">createApiLimiters</w:t>
             </w:r>
           </w:p>
         </w:tc>
@@ -37055,7 +37086,7 @@
                 <w:sz w:val="19"/>
                 <w:color w:val="172C43"/>
               </w:rPr>
-              <w:t xml:space="preserve">General and sensitive-route IP request limits.</w:t>
+              <w:t xml:space="preserve">Sensitive-route IP limits; general limits per verified user after sign-in, per IP for public and unauthenticated requests.</w:t>
             </w:r>
           </w:p>
         </w:tc>

</xml_diff>